<commit_message>
feat(reports): riesgo persistente calibrado + guia rapida v2
Riesgo persistente segun decisiones del dueno: el par consecutivo debe incluir la ultima evaluacion del periodo; los que dejaron de rendir van a tabla aparte con su ultima rendida; linea Ultima evaluacion considerada compartiendo fuente con el encabezado; sin columna Nivel constante, principal a 8pt. Verificado fila por fila contra SQL (Matematicas 40+12, Lenguaje 12+5). Helper parametrizado para fase 4. Guia rapida v2: estructura nueva del dueno, 11 repeticiones eliminadas, captura del modal Importar, Word regenerado. 1551 tests verdes.

Co-Authored-By: Claude Fable 5 <noreply@anthropic.com>
</commit_message>
<xml_diff>
--- a/docs/tutoriales/guia_rapida_usuario.docx
+++ b/docs/tutoriales/guia_rapida_usuario.docx
@@ -15,7 +15,7 @@
         <w:pStyle w:val="Subttulo"/>
       </w:pPr>
       <w:r>
-        <w:t>Cuatro pasos para cargar una evaluación y descargar tu informe</w:t>
+        <w:t>Entrar, cargar los datos, mirar los resultados y descargar el informe</w:t>
       </w:r>
     </w:p>
     <w:p>
@@ -27,23 +27,17 @@
       </w:r>
     </w:p>
     <w:p>
-      <w:pPr/>
-      <w:r>
-        <w:t>Necesitas: tu usuario y contraseña, y el archivo Excel de resultados tal como lo entrega la agencia evaluadora.</w:t>
-      </w:r>
-    </w:p>
-    <w:p>
       <w:pPr>
         <w:pStyle w:val="Ttulo1"/>
       </w:pPr>
       <w:r>
-        <w:t>Cargar tus datos</w:t>
-      </w:r>
-    </w:p>
-    <w:p>
-      <w:pPr/>
-      <w:r>
-        <w:t>Ingresa a la plataforma con tu correo y contraseña.</w:t>
+        <w:t>Entrar a la aplicación</w:t>
+      </w:r>
+    </w:p>
+    <w:p>
+      <w:pPr/>
+      <w:r>
+        <w:t>Abre la dirección de la plataforma e ingresa con tu correo y tu contraseña.</w:t>
       </w:r>
     </w:p>
     <w:p>
@@ -97,7 +91,35 @@
     <w:p>
       <w:pPr/>
       <w:r>
-        <w:t>En el menú de la izquierda entra a Ejecución. Ahí está el Centro de Ejecución, con una tarjeta por cada proceso de carga ya configurado para tu colegio. Busca la tarjeta de la evaluación que vas a cargar y haz clic en Ejecutar Proceso.</w:t>
+        <w:t>Si no las tienes, o la contraseña dejó de funcionar, pídeselas al administrador.</w:t>
+      </w:r>
+    </w:p>
+    <w:p>
+      <w:pPr>
+        <w:pStyle w:val="Ttulo1"/>
+      </w:pPr>
+      <w:r>
+        <w:t>Cargar los datos</w:t>
+      </w:r>
+    </w:p>
+    <w:p>
+      <w:pPr/>
+      <w:r>
+        <w:t>Hay dos caminos y se usa uno solo. Para saber cuál te toca, entra a Ejecución en el menú de la izquierda: ahí está el Centro de Ejecución, con una tarjeta por cada proceso de carga ya configurado para tu colegio. Si ves una con el nombre de tu evaluación, sigue el camino 2.1; si no aparece ninguna, sigue el 2.2.</w:t>
+      </w:r>
+    </w:p>
+    <w:p>
+      <w:pPr>
+        <w:pStyle w:val="Ttulo2"/>
+      </w:pPr>
+      <w:r>
+        <w:t>La evaluación tiene un proceso configurado (SIMCE, DIA)</w:t>
+      </w:r>
+    </w:p>
+    <w:p>
+      <w:pPr/>
+      <w:r>
+        <w:t>Busca la tarjeta de tu evaluación y haz clic en Ejecutar Proceso.</w:t>
       </w:r>
     </w:p>
     <w:p>
@@ -151,7 +173,7 @@
     <w:p>
       <w:pPr/>
       <w:r>
-        <w:t>Se abre una ventana que avanza por pasos. Cuando llegue a un paso que necesita tus archivos, se detiene y te muestra un recuadro por cada archivo pedido.</w:t>
+        <w:t>Se abre una ventana que avanza por pasos. Cuando llegue a uno que necesita tus archivos, se detiene y te muestra un recuadro por cada archivo pedido.</w:t>
       </w:r>
     </w:p>
     <w:p>
@@ -249,29 +271,65 @@
     <w:p>
       <w:pPr/>
       <w:r>
-        <w:t>Cuando termine verás el mensaje “¡Proceso Completado!”. Ahí tus datos ya quedaron guardados: cierra la ventana con Finalizar.</w:t>
-      </w:r>
-    </w:p>
-    <w:p>
-      <w:pPr>
-        <w:pStyle w:val="Destacado3"/>
-      </w:pPr>
-      <w:r>
-        <w:t>Sube el archivo original de la agencia, sin cambiar el orden de las columnas ni agregar filas arriba del encabezado.</w:t>
-      </w:r>
-    </w:p>
-    <w:p>
-      <w:pPr>
-        <w:pStyle w:val="Ttulo1"/>
-      </w:pPr>
-      <w:r>
-        <w:t>Revisar los datos en Valores</w:t>
-      </w:r>
-    </w:p>
-    <w:p>
-      <w:pPr/>
-      <w:r>
-        <w:t>Antes de mirar los resultados, conviene confirmar que lo que subiste quedó bien. Entra a Valores en el menú de la izquierda y elige la métrica que acabas de cargar. A la derecha aparecen los datos, con el total de filas arriba de la tabla.</w:t>
+        <w:t>Cuando termine verás el mensaje “¡Proceso Completado!”: tus datos ya quedaron guardados. Cierra la ventana con Finalizar. Qué archivo va en cada recuadro, y qué no hay que tocarle a cada uno, está en el anexo de carga por evaluación — un capítulo por evaluación.</w:t>
+      </w:r>
+    </w:p>
+    <w:p>
+      <w:pPr>
+        <w:pStyle w:val="Ttulo2"/>
+      </w:pPr>
+      <w:r>
+        <w:t>La evaluación no tiene proceso configurado</w:t>
+      </w:r>
+    </w:p>
+    <w:p>
+      <w:pPr/>
+      <w:r>
+        <w:t>Los datos se suben a mano, desde una planilla Excel:</w:t>
+      </w:r>
+    </w:p>
+    <w:p>
+      <w:r>
+        <w:t>Entra a Valores en el menú de la izquierda y elige la métrica que vas a llenar.</w:t>
+      </w:r>
+    </w:p>
+    <w:p>
+      <w:pPr/>
+      <w:r>
+        <w:t>• Entra a Valores en el menú de la izquierda y elige la métrica que vas a llenar.</w:t>
+      </w:r>
+    </w:p>
+    <w:p>
+      <w:r>
+        <w:t>Haz clic en Importar, arriba a la derecha de la tabla.</w:t>
+      </w:r>
+    </w:p>
+    <w:p>
+      <w:pPr/>
+      <w:r>
+        <w:t>• Haz clic en Importar, arriba a la derecha de la tabla.</w:t>
+      </w:r>
+    </w:p>
+    <w:p>
+      <w:r>
+        <w:t>Si todavía no tienes la planilla, usa Descargar Plantilla: baja un Excel con las columnas exactas de esa métrica, listo para rellenar.</w:t>
+      </w:r>
+    </w:p>
+    <w:p>
+      <w:pPr/>
+      <w:r>
+        <w:t>• Si todavía no tienes la planilla, usa Descargar Plantilla: baja un Excel con las columnas exactas de esa métrica, listo para rellenar.</w:t>
+      </w:r>
+    </w:p>
+    <w:p>
+      <w:r>
+        <w:t>Rellena la plantilla, arrástrala al recuadro (o usa Seleccionar Archivos) y haz clic en Importar.</w:t>
+      </w:r>
+    </w:p>
+    <w:p>
+      <w:pPr/>
+      <w:r>
+        <w:t>• Rellena la plantilla, arrástrala al recuadro (o usa Seleccionar Archivos) y haz clic en Importar.</w:t>
       </w:r>
     </w:p>
     <w:p>
@@ -290,7 +348,7 @@
               <a:graphicData uri="http://schemas.openxmlformats.org/drawingml/2006/picture">
                 <pic:pic>
                   <pic:nvPicPr>
-                    <pic:cNvPr id="0" name="values.png"/>
+                    <pic:cNvPr id="0" name="importar_valores.png"/>
                     <pic:cNvPicPr/>
                   </pic:nvPicPr>
                   <pic:blipFill>
@@ -319,41 +377,7 @@
         <w:jc w:val="center"/>
       </w:pPr>
       <w:r>
-        <w:t>Página de Valores con los filtros abiertos.</w:t>
-      </w:r>
-    </w:p>
-    <w:p>
-      <w:pPr/>
-      <w:r>
-        <w:t>Para revisar una parte específica:</w:t>
-      </w:r>
-    </w:p>
-    <w:p>
-      <w:r>
-        <w:t>Haz clic en Filtros para desplegar los filtros por columna (Año, Curso, Mes...). Abre el que necesites y marca los valores que quieres ver.</w:t>
-      </w:r>
-    </w:p>
-    <w:p>
-      <w:pPr/>
-      <w:r>
-        <w:t>• Haz clic en Filtros para desplegar los filtros por columna (Año, Curso, Mes...). Abre el que necesites y marca los valores que quieres ver.</w:t>
-      </w:r>
-    </w:p>
-    <w:p>
-      <w:r>
-        <w:t>Usa “Buscar en los datos...” para encontrar un nombre o un RUT concreto.</w:t>
-      </w:r>
-    </w:p>
-    <w:p>
-      <w:pPr/>
-      <w:r>
-        <w:t>• Usa “Buscar en los datos...” para encontrar un nombre o un RUT concreto.</w:t>
-      </w:r>
-    </w:p>
-    <w:p>
-      <w:pPr/>
-      <w:r>
-        <w:t>Revisa que el número de filas calce con lo que esperabas y que los cursos y meses sean los correctos.</w:t>
+        <w:t>Ventana Importar Datos, con el botón Descargar Plantilla.</w:t>
       </w:r>
     </w:p>
     <w:p>
@@ -361,21 +385,21 @@
         <w:pStyle w:val="Destacado3"/>
       </w:pPr>
       <w:r>
-        <w:t>¿Ves datos repetidos o de una carga equivocada? Avisa al administrador antes de seguir: es más fácil corregirlo ahora que después.</w:t>
-      </w:r>
-    </w:p>
-    <w:p>
-      <w:pPr>
-        <w:pStyle w:val="Ttulo1"/>
-      </w:pPr>
-      <w:r>
-        <w:t>Interpretar tu indicador</w:t>
-      </w:r>
-    </w:p>
-    <w:p>
-      <w:pPr/>
-      <w:r>
-        <w:t>Entra a Resultados y elige tu indicador en la lista de arriba. El panel se arma solo.</w:t>
+        <w:t>No cambies ni reordenes los títulos de las columnas de la plantilla: el sistema los usa para saber qué es cada dato.</w:t>
+      </w:r>
+    </w:p>
+    <w:p>
+      <w:pPr>
+        <w:pStyle w:val="Ttulo2"/>
+      </w:pPr>
+      <w:r>
+        <w:t>Revisa lo que quedó cargado</w:t>
+      </w:r>
+    </w:p>
+    <w:p>
+      <w:pPr/>
+      <w:r>
+        <w:t>Sea cual sea el camino, entra después a Valores, elige la métrica y confirma que el total de filas (arriba de la tabla) y los cursos y meses sean los que esperabas. Con Filtros acotas por columna y con “Buscar en los datos...” encuentras un nombre o un RUT concreto. Si ves datos repetidos o de una carga equivocada, avisa al administrador antes de seguir: es más fácil corregirlo ahora que después.</w:t>
       </w:r>
     </w:p>
     <w:p>
@@ -394,7 +418,7 @@
               <a:graphicData uri="http://schemas.openxmlformats.org/drawingml/2006/picture">
                 <pic:pic>
                   <pic:nvPicPr>
-                    <pic:cNvPr id="0" name="dashboard.png"/>
+                    <pic:cNvPr id="0" name="values.png"/>
                     <pic:cNvPicPr/>
                   </pic:nvPicPr>
                   <pic:blipFill>
@@ -423,63 +447,21 @@
         <w:jc w:val="center"/>
       </w:pPr>
       <w:r>
-        <w:t>Dashboard del indicador con gráficos.</w:t>
-      </w:r>
-    </w:p>
-    <w:p>
-      <w:pPr/>
-      <w:r>
-        <w:t>Lo que estás viendo:</w:t>
-      </w:r>
-    </w:p>
-    <w:p>
-      <w:r>
-        <w:t>Pestañas (Vista General, Por Curso, Por Estudiante, Tendencia): cada una muestra un corte distinto de los mismos datos.</w:t>
-      </w:r>
-    </w:p>
-    <w:p>
-      <w:pPr/>
-      <w:r>
-        <w:t>• Pestañas (Vista General, Por Curso, Por Estudiante, Tendencia): cada una muestra un corte distinto de los mismos datos.</w:t>
-      </w:r>
-    </w:p>
-    <w:p>
-      <w:r>
-        <w:t>Tarjetas de resumen: los números gruesos del total de alumnos, el rendimiento general y el nivel más frecuente.</w:t>
-      </w:r>
-    </w:p>
-    <w:p>
-      <w:pPr/>
-      <w:r>
-        <w:t>• Tarjetas de resumen: los números gruesos del total de alumnos, el rendimiento general y el nivel más frecuente.</w:t>
-      </w:r>
-    </w:p>
-    <w:p>
-      <w:r>
-        <w:t>Tablas y gráficos: el detalle curso por curso.</w:t>
-      </w:r>
-    </w:p>
-    <w:p>
-      <w:pPr/>
-      <w:r>
-        <w:t>• Tablas y gráficos: el detalle curso por curso.</w:t>
-      </w:r>
-    </w:p>
-    <w:p>
-      <w:r>
-        <w:t>Colores de los niveles de logro: son siempre los mismos en todo el sistema. El rojo marca el nivel más bajo y el verde el más alto, así que puedes leer un gráfico de un vistazo sin revisar la leyenda.</w:t>
-      </w:r>
-    </w:p>
-    <w:p>
-      <w:pPr/>
-      <w:r>
-        <w:t>• Colores de los niveles de logro: son siempre los mismos en todo el sistema. El rojo marca el nivel más bajo y el verde el más alto, así que puedes leer un gráfico de un vistazo sin revisar la leyenda.</w:t>
-      </w:r>
-    </w:p>
-    <w:p>
-      <w:pPr/>
-      <w:r>
-        <w:t>Para mirar solo una parte, usa los filtros que están bajo el indicador. Al elegir un valor aparece una etiqueta (un “chip”) con lo que está aplicado, y todos los gráficos se actualizan juntos.</w:t>
+        <w:t>Página de Valores con los filtros abiertos.</w:t>
+      </w:r>
+    </w:p>
+    <w:p>
+      <w:pPr>
+        <w:pStyle w:val="Ttulo1"/>
+      </w:pPr>
+      <w:r>
+        <w:t>Interpretar los resultados en el Dashboard</w:t>
+      </w:r>
+    </w:p>
+    <w:p>
+      <w:pPr/>
+      <w:r>
+        <w:t>Entra a Resultados y elige tu indicador en la lista de arriba. El panel se arma solo.</w:t>
       </w:r>
     </w:p>
     <w:p>
@@ -498,7 +480,7 @@
               <a:graphicData uri="http://schemas.openxmlformats.org/drawingml/2006/picture">
                 <pic:pic>
                   <pic:nvPicPr>
-                    <pic:cNvPr id="0" name="dashboard_filtros.png"/>
+                    <pic:cNvPr id="0" name="dashboard.png"/>
                     <pic:cNvPicPr/>
                   </pic:nvPicPr>
                   <pic:blipFill>
@@ -527,35 +509,57 @@
         <w:jc w:val="center"/>
       </w:pPr>
       <w:r>
-        <w:t>Dashboard con un filtro de curso aplicado.</w:t>
-      </w:r>
-    </w:p>
-    <w:p>
-      <w:pPr/>
-      <w:r>
-        <w:t>Quita un filtro con la × de su chip, o sácalos todos con Limpiar.</w:t>
-      </w:r>
-    </w:p>
-    <w:p>
-      <w:pPr>
-        <w:pStyle w:val="Destacado3"/>
-      </w:pPr>
-      <w:r>
-        <w:t>Si un gráfico se ve vacío, casi siempre es porque los filtros activos no dejan ningún dato. Quítalos de a uno hasta que reaparezca.</w:t>
-      </w:r>
-    </w:p>
-    <w:p>
-      <w:pPr>
-        <w:pStyle w:val="Ttulo1"/>
-      </w:pPr>
-      <w:r>
-        <w:t>Descargar informes</w:t>
-      </w:r>
-    </w:p>
-    <w:p>
-      <w:pPr/>
-      <w:r>
-        <w:t>Con tu indicador en pantalla, haz clic en Generar informe.</w:t>
+        <w:t>Dashboard del indicador con gráficos.</w:t>
+      </w:r>
+    </w:p>
+    <w:p>
+      <w:r>
+        <w:t>Pestañas (Vista General, Por Curso, Por Estudiante, Tendencia): cada una muestra un corte distinto de los mismos datos.</w:t>
+      </w:r>
+    </w:p>
+    <w:p>
+      <w:pPr/>
+      <w:r>
+        <w:t>• Pestañas (Vista General, Por Curso, Por Estudiante, Tendencia): cada una muestra un corte distinto de los mismos datos.</w:t>
+      </w:r>
+    </w:p>
+    <w:p>
+      <w:r>
+        <w:t>Tarjetas de resumen: los números gruesos del total de alumnos, el rendimiento general y el nivel más frecuente.</w:t>
+      </w:r>
+    </w:p>
+    <w:p>
+      <w:pPr/>
+      <w:r>
+        <w:t>• Tarjetas de resumen: los números gruesos del total de alumnos, el rendimiento general y el nivel más frecuente.</w:t>
+      </w:r>
+    </w:p>
+    <w:p>
+      <w:r>
+        <w:t>Tablas y gráficos: el detalle curso por curso.</w:t>
+      </w:r>
+    </w:p>
+    <w:p>
+      <w:pPr/>
+      <w:r>
+        <w:t>• Tablas y gráficos: el detalle curso por curso.</w:t>
+      </w:r>
+    </w:p>
+    <w:p>
+      <w:r>
+        <w:t>Colores de los niveles de logro: siempre los mismos en todo el sistema (rojo el nivel más bajo, verde el más alto), para leer un gráfico sin revisar la leyenda.</w:t>
+      </w:r>
+    </w:p>
+    <w:p>
+      <w:pPr/>
+      <w:r>
+        <w:t>• Colores de los niveles de logro: siempre los mismos en todo el sistema (rojo el nivel más bajo, verde el más alto), para leer un gráfico sin revisar la leyenda.</w:t>
+      </w:r>
+    </w:p>
+    <w:p>
+      <w:pPr/>
+      <w:r>
+        <w:t>Para mirar solo una parte, usa los filtros que están bajo el indicador. Al elegir un valor aparece una etiqueta (un “chip”) con lo que está aplicado y todos los gráficos se actualizan juntos. Quita un filtro con la × de su chip, o sácalos todos con Limpiar.</w:t>
       </w:r>
     </w:p>
     <w:p>
@@ -574,7 +578,7 @@
               <a:graphicData uri="http://schemas.openxmlformats.org/drawingml/2006/picture">
                 <pic:pic>
                   <pic:nvPicPr>
-                    <pic:cNvPr id="0" name="generar_informe.png"/>
+                    <pic:cNvPr id="0" name="dashboard_filtros.png"/>
                     <pic:cNvPicPr/>
                   </pic:nvPicPr>
                   <pic:blipFill>
@@ -603,13 +607,77 @@
         <w:jc w:val="center"/>
       </w:pPr>
       <w:r>
+        <w:t>Dashboard con un filtro de curso aplicado.</w:t>
+      </w:r>
+    </w:p>
+    <w:p>
+      <w:pPr>
+        <w:pStyle w:val="Destacado3"/>
+      </w:pPr>
+      <w:r>
+        <w:t>Si un gráfico se ve vacío, casi siempre es porque los filtros activos no dejan ningún dato. Quítalos de a uno hasta que reaparezca.</w:t>
+      </w:r>
+    </w:p>
+    <w:p>
+      <w:pPr>
+        <w:pStyle w:val="Ttulo1"/>
+      </w:pPr>
+      <w:r>
+        <w:t>Exportar el informe</w:t>
+      </w:r>
+    </w:p>
+    <w:p>
+      <w:pPr/>
+      <w:r>
+        <w:t>Con tu indicador en pantalla, haz clic en Generar informe. Un clic en la tarjeta que necesites descarga el PDF de inmediato.</w:t>
+      </w:r>
+    </w:p>
+    <w:p>
+      <w:pPr>
+        <w:jc w:val="center"/>
+      </w:pPr>
+      <w:r>
+        <w:drawing>
+          <wp:inline xmlns:a="http://schemas.openxmlformats.org/drawingml/2006/main" xmlns:pic="http://schemas.openxmlformats.org/drawingml/2006/picture">
+            <wp:extent cx="5303520" cy="3314700"/>
+            <wp:docPr id="8" name="Picture 8"/>
+            <wp:cNvGraphicFramePr>
+              <a:graphicFrameLocks noChangeAspect="1"/>
+            </wp:cNvGraphicFramePr>
+            <a:graphic>
+              <a:graphicData uri="http://schemas.openxmlformats.org/drawingml/2006/picture">
+                <pic:pic>
+                  <pic:nvPicPr>
+                    <pic:cNvPr id="0" name="generar_informe.png"/>
+                    <pic:cNvPicPr/>
+                  </pic:nvPicPr>
+                  <pic:blipFill>
+                    <a:blip r:embed="rId19"/>
+                    <a:stretch>
+                      <a:fillRect/>
+                    </a:stretch>
+                  </pic:blipFill>
+                  <pic:spPr>
+                    <a:xfrm>
+                      <a:off x="0" y="0"/>
+                      <a:ext cx="5303520" cy="3314700"/>
+                    </a:xfrm>
+                    <a:prstGeom prst="rect"/>
+                  </pic:spPr>
+                </pic:pic>
+              </a:graphicData>
+            </a:graphic>
+          </wp:inline>
+        </w:drawing>
+      </w:r>
+    </w:p>
+    <w:p>
+      <w:pPr>
+        <w:pStyle w:val="Descripcin"/>
+        <w:jc w:val="center"/>
+      </w:pPr>
+      <w:r>
         <w:t>Ventana Generar informe con las tarjetas de período.</w:t>
-      </w:r>
-    </w:p>
-    <w:p>
-      <w:pPr/>
-      <w:r>
-        <w:t>Elige la tarjeta que necesites. Un clic descarga el PDF de inmediato:</w:t>
       </w:r>
     </w:p>
     <w:tbl>
@@ -736,7 +804,13 @@
     <w:p>
       <w:pPr/>
       <w:r>
-        <w:t>Más abajo, en Informes especializados, están los informes con formato oficial de cada evaluación.</w:t>
+        <w:t>Más abajo, en Informes especializados, están los informes con el formato oficial de cada evaluación. El botón de deslizadores, a la derecha de cada tarjeta, abre un panel para ajustar los títulos del encabezado, el pie de página y el nombre del archivo antes de descargar.</w:t>
+      </w:r>
+    </w:p>
+    <w:p>
+      <w:pPr/>
+      <w:r>
+        <w:t>Una tarjeta gris no se puede descargar, y la razón está escrita en ella: “Sin datos cargados para este indicador” (vuelve a la sección 2) o “Este informe aún no está configurado” (avísale al administrador). Así se ve el PDF que descargas:</w:t>
       </w:r>
     </w:p>
     <w:p>
@@ -747,7 +821,7 @@
         <w:drawing>
           <wp:inline xmlns:a="http://schemas.openxmlformats.org/drawingml/2006/main" xmlns:pic="http://schemas.openxmlformats.org/drawingml/2006/picture">
             <wp:extent cx="5303520" cy="6863379"/>
-            <wp:docPr id="8" name="Picture 8"/>
+            <wp:docPr id="9" name="Picture 9"/>
             <wp:cNvGraphicFramePr>
               <a:graphicFrameLocks noChangeAspect="1"/>
             </wp:cNvGraphicFramePr>
@@ -759,7 +833,7 @@
                     <pic:cNvPicPr/>
                   </pic:nvPicPr>
                   <pic:blipFill>
-                    <a:blip r:embed="rId19"/>
+                    <a:blip r:embed="rId20"/>
                     <a:stretch>
                       <a:fillRect/>
                     </a:stretch>
@@ -789,56 +863,6 @@
     </w:p>
     <w:p>
       <w:pPr>
-        <w:pStyle w:val="Ttulo2"/>
-      </w:pPr>
-      <w:r>
-        <w:t>Personalizar antes de descargar</w:t>
-      </w:r>
-    </w:p>
-    <w:p>
-      <w:pPr/>
-      <w:r>
-        <w:t>El botón de deslizadores (a la derecha de cada tarjeta) abre un panel para ajustar los títulos del encabezado, el pie de página y el nombre del archivo. Cambia lo que necesites y descarga desde ahí.</w:t>
-      </w:r>
-    </w:p>
-    <w:p>
-      <w:pPr>
-        <w:pStyle w:val="Ttulo2"/>
-      </w:pPr>
-      <w:r>
-        <w:t>Si una tarjeta está gris</w:t>
-      </w:r>
-    </w:p>
-    <w:p>
-      <w:pPr/>
-      <w:r>
-        <w:t>Una tarjeta apagada no se puede descargar, y la razón está escrita en la misma tarjeta. Las dos más comunes:</w:t>
-      </w:r>
-    </w:p>
-    <w:p>
-      <w:r>
-        <w:t>“Sin datos cargados para este indicador”: vuelve al Paso 1.</w:t>
-      </w:r>
-    </w:p>
-    <w:p>
-      <w:pPr/>
-      <w:r>
-        <w:t>• “Sin datos cargados para este indicador”: vuelve al Paso 1.</w:t>
-      </w:r>
-    </w:p>
-    <w:p>
-      <w:r>
-        <w:t>“Este informe aún no está configurado”: avísale al administrador.</w:t>
-      </w:r>
-    </w:p>
-    <w:p>
-      <w:pPr/>
-      <w:r>
-        <w:t>• “Este informe aún no está configurado”: avísale al administrador.</w:t>
-      </w:r>
-    </w:p>
-    <w:p>
-      <w:pPr>
         <w:pStyle w:val="Destacado3"/>
       </w:pPr>
       <w:r>
@@ -846,9 +870,62 @@
       </w:r>
     </w:p>
     <w:p>
-      <w:pPr/>
-      <w:r>
-        <w:t>¿Se te quedó algo en el camino? El tutorial extendido (docs/tutoriales/tutorial_usuario.md) tiene el paso a paso completo y una tabla de problemas frecuentes.</w:t>
+      <w:pPr>
+        <w:pStyle w:val="Ttulo1"/>
+      </w:pPr>
+      <w:r>
+        <w:t>Anexo — Archivos necesarios por evaluación</w:t>
+      </w:r>
+    </w:p>
+    <w:p>
+      <w:pPr/>
+      <w:r>
+        <w:t>Lo que hay que tener a mano antes de empezar la carga. El detalle de cada archivo (nombre del recuadro, formato y qué no hay que modificarle) está en el anexo de carga por evaluación:</w:t>
+      </w:r>
+    </w:p>
+    <w:p>
+      <w:r>
+        <w:t>SIMCE Pullinque: Resultados por alumno · Resultados por pregunta · Habilidad y Eje Temático.</w:t>
+      </w:r>
+    </w:p>
+    <w:p>
+      <w:pPr/>
+      <w:r>
+        <w:t>• SIMCE Pullinque: Resultados por alumno · Resultados por pregunta · Habilidad y Eje Temático.</w:t>
+      </w:r>
+    </w:p>
+    <w:p>
+      <w:r>
+        <w:t>DIA: PDF de resultados · Excel con resultados por alumno.</w:t>
+      </w:r>
+    </w:p>
+    <w:p>
+      <w:pPr/>
+      <w:r>
+        <w:t>• DIA: PDF de resultados · Excel con resultados por alumno.</w:t>
+      </w:r>
+    </w:p>
+    <w:p>
+      <w:r>
+        <w:t>SIMCE Panguipulli: pendiente el exporte de Aptus.</w:t>
+      </w:r>
+    </w:p>
+    <w:p>
+      <w:pPr/>
+      <w:r>
+        <w:t>• SIMCE Panguipulli: pendiente el exporte de Aptus.</w:t>
+      </w:r>
+    </w:p>
+    <w:p>
+      <w:pPr/>
+      <w:r>
+        <w:t>Las evaluaciones que no están en esta lista se cargan por el camino 2.2 (Valores → Importar).</w:t>
+      </w:r>
+    </w:p>
+    <w:p>
+      <w:pPr/>
+      <w:r>
+        <w:t>¿Se te quedó algo en el camino? El tutorial extendido tiene el paso a paso completo y una tabla de problemas frecuentes.</w:t>
       </w:r>
     </w:p>
     <w:sectPr>

</xml_diff>

<commit_message>
docs: guia rapida legible para usuario no tecnico + Word regenerado
Revision de legibilidad con criterio del dueno (entendible por un usuario de 15 annos / nivel tecnico bajo): auditoria de jerga termino a termino (proceso, metrica, indicador y administrador explicados la primera vez; chip, corte, acotar y exporte eliminados; rotulos de UI intactos en negrita), oraciones divididas a una instruccion por frase, condicionales anidados separados. Estructura, headings, imagenes y placeholders byte-identicos. Anexo con 8 retoques de lenguaje. Word regenerado con la plantilla personal.

Co-Authored-By: Claude Fable 5 <noreply@anthropic.com>
</commit_message>
<xml_diff>
--- a/docs/tutoriales/guia_rapida_usuario.docx
+++ b/docs/tutoriales/guia_rapida_usuario.docx
@@ -23,7 +23,7 @@
         <w:pStyle w:val="Destacado2"/>
       </w:pPr>
       <w:r>
-        <w:t>Las imágenes de esta guía son de una organización de demostración, con datos inventados. En tu cuenta verás los nombres y cursos de tu propio colegio.</w:t>
+        <w:t>Las imágenes de esta guía son de un colegio de ejemplo, con datos inventados. En tu cuenta vas a ver los nombres y cursos de tu propio colegio.</w:t>
       </w:r>
     </w:p>
     <w:p>
@@ -37,7 +37,7 @@
     <w:p>
       <w:pPr/>
       <w:r>
-        <w:t>Abre la dirección de la plataforma e ingresa con tu correo y tu contraseña.</w:t>
+        <w:t>Abre la dirección de la plataforma. Escribe tu correo y tu contraseña.</w:t>
       </w:r>
     </w:p>
     <w:p>
@@ -91,7 +91,7 @@
     <w:p>
       <w:pPr/>
       <w:r>
-        <w:t>Si no las tienes, o la contraseña dejó de funcionar, pídeselas al administrador.</w:t>
+        <w:t>¿No tienes correo y contraseña? ¿La contraseña dejó de funcionar? Pídeselas al administrador (la persona que maneja las cuentas de tu colegio).</w:t>
       </w:r>
     </w:p>
     <w:p>
@@ -105,7 +105,7 @@
     <w:p>
       <w:pPr/>
       <w:r>
-        <w:t>Hay dos caminos y se usa uno solo. Para saber cuál te toca, entra a Ejecución en el menú de la izquierda: ahí está el Centro de Ejecución, con una tarjeta por cada proceso de carga ya configurado para tu colegio. Si ves una con el nombre de tu evaluación, sigue el camino 2.1; si no aparece ninguna, sigue el 2.2.</w:t>
+        <w:t>Hay dos caminos y vas a usar solo uno. Para saber cuál te toca, entra a Ejecución en el menú de la izquierda. Esa pantalla se llama Centro de Ejecución y muestra una tarjeta por cada proceso ya configurado para tu colegio. Un proceso es una carga automática que el equipo dejó lista: tú solo entregas los archivos. Si ves una tarjeta con el nombre de tu evaluación, sigue el camino 2.1. Si no aparece ninguna, sigue el 2.2.</w:t>
       </w:r>
     </w:p>
     <w:p>
@@ -173,7 +173,7 @@
     <w:p>
       <w:pPr/>
       <w:r>
-        <w:t>Se abre una ventana que avanza por pasos. Cuando llegue a uno que necesita tus archivos, se detiene y te muestra un recuadro por cada archivo pedido.</w:t>
+        <w:t>Se abre una ventana que avanza sola, paso a paso. Cuando necesite tus archivos se detiene y te muestra un recuadro por cada archivo que pide.</w:t>
       </w:r>
     </w:p>
     <w:p>
@@ -226,52 +226,58 @@
     </w:p>
     <w:p>
       <w:r>
-        <w:t>Arrastra el archivo al recuadro, o haz clic para buscarlo en tu computador.</w:t>
-      </w:r>
-    </w:p>
-    <w:p>
-      <w:pPr/>
-      <w:r>
-        <w:t>• Arrastra el archivo al recuadro, o haz clic para buscarlo en tu computador.</w:t>
-      </w:r>
-    </w:p>
-    <w:p>
-      <w:r>
-        <w:t>Repite con cada recuadro. Los que dicen “opcional” puedes dejarlos vacíos.</w:t>
-      </w:r>
-    </w:p>
-    <w:p>
-      <w:pPr/>
-      <w:r>
-        <w:t>• Repite con cada recuadro. Los que dicen “opcional” puedes dejarlos vacíos.</w:t>
-      </w:r>
-    </w:p>
-    <w:p>
-      <w:r>
-        <w:t>Haz clic en Siguiente para continuar.</w:t>
-      </w:r>
-    </w:p>
-    <w:p>
-      <w:pPr/>
-      <w:r>
-        <w:t>• Haz clic en Siguiente para continuar.</w:t>
-      </w:r>
-    </w:p>
-    <w:p>
-      <w:r>
-        <w:t>Si el proceso te pide un dato extra (por ejemplo, el hito de la evaluación), complétalo y confirma.</w:t>
-      </w:r>
-    </w:p>
-    <w:p>
-      <w:pPr/>
-      <w:r>
-        <w:t>• Si el proceso te pide un dato extra (por ejemplo, el hito de la evaluación), complétalo y confirma.</w:t>
-      </w:r>
-    </w:p>
-    <w:p>
-      <w:pPr/>
-      <w:r>
-        <w:t>Cuando termine verás el mensaje “¡Proceso Completado!”: tus datos ya quedaron guardados. Cierra la ventana con Finalizar. Qué archivo va en cada recuadro, y qué no hay que tocarle a cada uno, está en el anexo de carga por evaluación — un capítulo por evaluación.</w:t>
+        <w:t>Arrastra el archivo hasta el recuadro, o haz clic en el recuadro y búscalo en tu computador.</w:t>
+      </w:r>
+    </w:p>
+    <w:p>
+      <w:pPr/>
+      <w:r>
+        <w:t>• Arrastra el archivo hasta el recuadro, o haz clic en el recuadro y búscalo en tu computador.</w:t>
+      </w:r>
+    </w:p>
+    <w:p>
+      <w:r>
+        <w:t>Haz lo mismo con cada recuadro. Los que dicen “opcional” puedes dejarlos vacíos.</w:t>
+      </w:r>
+    </w:p>
+    <w:p>
+      <w:pPr/>
+      <w:r>
+        <w:t>• Haz lo mismo con cada recuadro. Los que dicen “opcional” puedes dejarlos vacíos.</w:t>
+      </w:r>
+    </w:p>
+    <w:p>
+      <w:r>
+        <w:t>Haz clic en Siguiente y el proceso sigue avanzando.</w:t>
+      </w:r>
+    </w:p>
+    <w:p>
+      <w:pPr/>
+      <w:r>
+        <w:t>• Haz clic en Siguiente y el proceso sigue avanzando.</w:t>
+      </w:r>
+    </w:p>
+    <w:p>
+      <w:r>
+        <w:t>A veces el proceso te pide además un dato escrito, por ejemplo el mes de la prueba. Complétalo y confirma.</w:t>
+      </w:r>
+    </w:p>
+    <w:p>
+      <w:pPr/>
+      <w:r>
+        <w:t>• A veces el proceso te pide además un dato escrito, por ejemplo el mes de la prueba. Complétalo y confirma.</w:t>
+      </w:r>
+    </w:p>
+    <w:p>
+      <w:pPr/>
+      <w:r>
+        <w:t>Cuando termine vas a ver el mensaje “¡Proceso Completado!”: tus datos ya quedaron guardados. Cierra la ventana con Finalizar.</w:t>
+      </w:r>
+    </w:p>
+    <w:p>
+      <w:pPr/>
+      <w:r>
+        <w:t>¿Qué archivo va en cada recuadro? ¿Qué no hay que modificarle? Está todo en el anexo de carga por evaluación.</w:t>
       </w:r>
     </w:p>
     <w:p>
@@ -290,13 +296,13 @@
     </w:p>
     <w:p>
       <w:r>
-        <w:t>Entra a Valores en el menú de la izquierda y elige la métrica que vas a llenar.</w:t>
-      </w:r>
-    </w:p>
-    <w:p>
-      <w:pPr/>
-      <w:r>
-        <w:t>• Entra a Valores en el menú de la izquierda y elige la métrica que vas a llenar.</w:t>
+        <w:t>Entra a Valores en el menú de la izquierda y elige la métrica que vas a llenar (una métrica es un conjunto de datos, por ejemplo los puntajes de SIMCE Lenguaje).</w:t>
+      </w:r>
+    </w:p>
+    <w:p>
+      <w:pPr/>
+      <w:r>
+        <w:t>• Entra a Valores en el menú de la izquierda y elige la métrica que vas a llenar (una métrica es un conjunto de datos, por ejemplo los puntajes de SIMCE Lenguaje).</w:t>
       </w:r>
     </w:p>
     <w:p>
@@ -312,24 +318,35 @@
     </w:p>
     <w:p>
       <w:r>
-        <w:t>Si todavía no tienes la planilla, usa Descargar Plantilla: baja un Excel con las columnas exactas de esa métrica, listo para rellenar.</w:t>
-      </w:r>
-    </w:p>
-    <w:p>
-      <w:pPr/>
-      <w:r>
-        <w:t>• Si todavía no tienes la planilla, usa Descargar Plantilla: baja un Excel con las columnas exactas de esa métrica, listo para rellenar.</w:t>
-      </w:r>
-    </w:p>
-    <w:p>
-      <w:r>
-        <w:t>Rellena la plantilla, arrástrala al recuadro (o usa Seleccionar Archivos) y haz clic en Importar.</w:t>
-      </w:r>
-    </w:p>
-    <w:p>
-      <w:pPr/>
-      <w:r>
-        <w:t>• Rellena la plantilla, arrástrala al recuadro (o usa Seleccionar Archivos) y haz clic en Importar.</w:t>
+        <w:t>¿Todavía no tienes la planilla? Haz clic en Descargar Plantilla. Se baja un Excel con las columnas exactas de esa métrica, listo para rellenar.</w:t>
+      </w:r>
+    </w:p>
+    <w:p>
+      <w:pPr/>
+      <w:r>
+        <w:t>• ¿Todavía no tienes la planilla? Haz clic en Descargar Plantilla. Se baja un Excel con las columnas exactas de esa métrica, listo para rellenar.</w:t>
+      </w:r>
+    </w:p>
+    <w:p>
+      <w:r>
+        <w:t>Rellena la planilla.</w:t>
+      </w:r>
+    </w:p>
+    <w:p>
+      <w:pPr/>
+      <w:r>
+        <w:t>• Rellena la planilla.</w:t>
+      </w:r>
+    </w:p>
+    <w:p>
+      <w:r>
+        <w:t>Arrástrala al recuadro, o búscala con Seleccionar Archivos, y haz clic en Importar.</w:t>
+      </w:r>
+    </w:p>
+    <w:p>
+      <w:pPr/>
+      <w:r>
+        <w:t>• Arrástrala al recuadro, o búscala con Seleccionar Archivos, y haz clic en Importar.</w:t>
       </w:r>
     </w:p>
     <w:p>
@@ -385,7 +402,7 @@
         <w:pStyle w:val="Destacado3"/>
       </w:pPr>
       <w:r>
-        <w:t>No cambies ni reordenes los títulos de las columnas de la plantilla: el sistema los usa para saber qué es cada dato.</w:t>
+        <w:t>No cambies ni muevas los títulos de las columnas de la plantilla. El sistema los usa para saber qué es cada dato.</w:t>
       </w:r>
     </w:p>
     <w:p>
@@ -399,7 +416,7 @@
     <w:p>
       <w:pPr/>
       <w:r>
-        <w:t>Sea cual sea el camino, entra después a Valores, elige la métrica y confirma que el total de filas (arriba de la tabla) y los cursos y meses sean los que esperabas. Con Filtros acotas por columna y con “Buscar en los datos...” encuentras un nombre o un RUT concreto. Si ves datos repetidos o de una carga equivocada, avisa al administrador antes de seguir: es más fácil corregirlo ahora que después.</w:t>
+        <w:t>Con cualquiera de los dos caminos, revisa lo que quedó guardado. Entra a Valores y elige tu métrica. Mira el total de filas, que aparece arriba de la tabla, y confirma que los cursos y los meses sean los que esperabas. El botón Filtros te deja mostrar solo una parte de la tabla, por ejemplo un curso. En “Buscar en los datos...” escribes un nombre o un RUT para encontrarlo. Si ves datos repetidos, o datos de una carga equivocada, avisa al administrador antes de seguir: es más fácil corregirlo ahora que después.</w:t>
       </w:r>
     </w:p>
     <w:p>
@@ -461,7 +478,7 @@
     <w:p>
       <w:pPr/>
       <w:r>
-        <w:t>Entra a Resultados y elige tu indicador en la lista de arriba. El panel se arma solo.</w:t>
+        <w:t>Entra a Resultados y elige tu indicador en la lista de arriba. Un indicador es aquello que la evaluación mide, por ejemplo la comprensión lectora. Los gráficos se arman solos: esa pantalla llena de gráficos es el dashboard.</w:t>
       </w:r>
     </w:p>
     <w:p>
@@ -514,24 +531,24 @@
     </w:p>
     <w:p>
       <w:r>
-        <w:t>Pestañas (Vista General, Por Curso, Por Estudiante, Tendencia): cada una muestra un corte distinto de los mismos datos.</w:t>
-      </w:r>
-    </w:p>
-    <w:p>
-      <w:pPr/>
-      <w:r>
-        <w:t>• Pestañas (Vista General, Por Curso, Por Estudiante, Tendencia): cada una muestra un corte distinto de los mismos datos.</w:t>
-      </w:r>
-    </w:p>
-    <w:p>
-      <w:r>
-        <w:t>Tarjetas de resumen: los números gruesos del total de alumnos, el rendimiento general y el nivel más frecuente.</w:t>
-      </w:r>
-    </w:p>
-    <w:p>
-      <w:pPr/>
-      <w:r>
-        <w:t>• Tarjetas de resumen: los números gruesos del total de alumnos, el rendimiento general y el nivel más frecuente.</w:t>
+        <w:t>Pestañas (Vista General, Por Curso, Por Estudiante, Tendencia): cada una muestra los mismos datos, pero mirados de otra forma.</w:t>
+      </w:r>
+    </w:p>
+    <w:p>
+      <w:pPr/>
+      <w:r>
+        <w:t>• Pestañas (Vista General, Por Curso, Por Estudiante, Tendencia): cada una muestra los mismos datos, pero mirados de otra forma.</w:t>
+      </w:r>
+    </w:p>
+    <w:p>
+      <w:r>
+        <w:t>Tarjetas de resumen: los números grandes de arriba. Traen el total de alumnos, el rendimiento general y el nivel que más se repite.</w:t>
+      </w:r>
+    </w:p>
+    <w:p>
+      <w:pPr/>
+      <w:r>
+        <w:t>• Tarjetas de resumen: los números grandes de arriba. Traen el total de alumnos, el rendimiento general y el nivel que más se repite.</w:t>
       </w:r>
     </w:p>
     <w:p>
@@ -547,19 +564,19 @@
     </w:p>
     <w:p>
       <w:r>
-        <w:t>Colores de los niveles de logro: siempre los mismos en todo el sistema (rojo el nivel más bajo, verde el más alto), para leer un gráfico sin revisar la leyenda.</w:t>
-      </w:r>
-    </w:p>
-    <w:p>
-      <w:pPr/>
-      <w:r>
-        <w:t>• Colores de los niveles de logro: siempre los mismos en todo el sistema (rojo el nivel más bajo, verde el más alto), para leer un gráfico sin revisar la leyenda.</w:t>
-      </w:r>
-    </w:p>
-    <w:p>
-      <w:pPr/>
-      <w:r>
-        <w:t>Para mirar solo una parte, usa los filtros que están bajo el indicador. Al elegir un valor aparece una etiqueta (un “chip”) con lo que está aplicado y todos los gráficos se actualizan juntos. Quita un filtro con la × de su chip, o sácalos todos con Limpiar.</w:t>
+        <w:t>Colores de los niveles de logro: son siempre los mismos en todo el sistema, rojo el nivel más bajo y verde el más alto. Así lees un gráfico sin revisar la leyenda.</w:t>
+      </w:r>
+    </w:p>
+    <w:p>
+      <w:pPr/>
+      <w:r>
+        <w:t>• Colores de los niveles de logro: son siempre los mismos en todo el sistema, rojo el nivel más bajo y verde el más alto. Así lees un gráfico sin revisar la leyenda.</w:t>
+      </w:r>
+    </w:p>
+    <w:p>
+      <w:pPr/>
+      <w:r>
+        <w:t>Para mirar solo una parte de los datos, usa los filtros que están debajo del indicador. Al elegir un valor aparece una etiqueta con el filtro que quedó puesto, y todos los gráficos se actualizan al mismo tiempo. Para sacar un filtro, haz clic en la × de su etiqueta. Para sacarlos todos de una vez, usa Limpiar.</w:t>
       </w:r>
     </w:p>
     <w:p>
@@ -615,7 +632,7 @@
         <w:pStyle w:val="Destacado3"/>
       </w:pPr>
       <w:r>
-        <w:t>Si un gráfico se ve vacío, casi siempre es porque los filtros activos no dejan ningún dato. Quítalos de a uno hasta que reaparezca.</w:t>
+        <w:t>¿Un gráfico se ve vacío? Casi siempre es porque los filtros puestos no dejan pasar ningún dato. Sácalos de a uno hasta que el gráfico vuelva a aparecer.</w:t>
       </w:r>
     </w:p>
     <w:p>
@@ -629,7 +646,7 @@
     <w:p>
       <w:pPr/>
       <w:r>
-        <w:t>Con tu indicador en pantalla, haz clic en Generar informe. Un clic en la tarjeta que necesites descarga el PDF de inmediato.</w:t>
+        <w:t>Con tu indicador en pantalla, haz clic en Generar informe. Se abre una ventana con una tarjeta por cada tipo de informe. Haz clic en la que necesites y el PDF se descarga.</w:t>
       </w:r>
     </w:p>
     <w:p>
@@ -751,7 +768,7 @@
           </w:tcPr>
           <w:p>
             <w:r>
-              <w:t>La evolución del semestre en curso.</w:t>
+              <w:t>Cómo cambiaron los resultados durante el semestre.</w:t>
             </w:r>
           </w:p>
         </w:tc>
@@ -773,7 +790,7 @@
           </w:tcPr>
           <w:p>
             <w:r>
-              <w:t>La evolución del año.</w:t>
+              <w:t>Cómo cambiaron los resultados durante el año.</w:t>
             </w:r>
           </w:p>
         </w:tc>
@@ -795,7 +812,7 @@
           </w:tcPr>
           <w:p>
             <w:r>
-              <w:t>Tú eliges el rango de fechas y los filtros.</w:t>
+              <w:t>Tú eliges desde qué fecha hasta qué fecha, y qué filtros usar.</w:t>
             </w:r>
           </w:p>
         </w:tc>
@@ -804,13 +821,13 @@
     <w:p>
       <w:pPr/>
       <w:r>
-        <w:t>Más abajo, en Informes especializados, están los informes con el formato oficial de cada evaluación. El botón de deslizadores, a la derecha de cada tarjeta, abre un panel para ajustar los títulos del encabezado, el pie de página y el nombre del archivo antes de descargar.</w:t>
-      </w:r>
-    </w:p>
-    <w:p>
-      <w:pPr/>
-      <w:r>
-        <w:t>Una tarjeta gris no se puede descargar, y la razón está escrita en ella: “Sin datos cargados para este indicador” (vuelve a la sección 2) o “Este informe aún no está configurado” (avísale al administrador). Así se ve el PDF que descargas:</w:t>
+        <w:t>Más abajo, en Informes especializados, están los informes con el formato oficial de cada evaluación. A la derecha de cada tarjeta hay un botón con forma de controles deslizantes. Ese botón abre un panel para cambiar, antes de descargar, el texto de arriba del PDF, el de abajo y el nombre del archivo.</w:t>
+      </w:r>
+    </w:p>
+    <w:p>
+      <w:pPr/>
+      <w:r>
+        <w:t>Las tarjetas grises no se pueden descargar y la razón está escrita en la misma tarjeta. Si dice “Sin datos cargados para este indicador”, vuelve a la sección 2. Si dice “Este informe aún no está configurado”, avísale al administrador. Así se ve el PDF que descargas:</w:t>
       </w:r>
     </w:p>
     <w:p>
@@ -866,7 +883,7 @@
         <w:pStyle w:val="Destacado3"/>
       </w:pPr>
       <w:r>
-        <w:t>Los informes especializados a veces piden que primero filtres a una sola prueba (un Mes o un N° de prueba). El sistema te lo indica antes de generarlo.</w:t>
+        <w:t>Algunos informes especializados necesitan que primero dejes una sola prueba a la vista, filtrando por Mes o por N° de prueba. El sistema te lo avisa antes de generarlo.</w:t>
       </w:r>
     </w:p>
     <w:p>
@@ -880,7 +897,7 @@
     <w:p>
       <w:pPr/>
       <w:r>
-        <w:t>Lo que hay que tener a mano antes de empezar la carga. El detalle de cada archivo (nombre del recuadro, formato y qué no hay que modificarle) está en el anexo de carga por evaluación:</w:t>
+        <w:t>Lo que tienes que tener a mano antes de empezar la carga. El detalle de cada archivo está en el anexo de carga por evaluación: cómo se llama el recuadro en pantalla, en qué formato va y qué no hay que modificarle.</w:t>
       </w:r>
     </w:p>
     <w:p>
@@ -907,25 +924,25 @@
     </w:p>
     <w:p>
       <w:r>
-        <w:t>SIMCE Panguipulli: pendiente el exporte de Aptus.</w:t>
-      </w:r>
-    </w:p>
-    <w:p>
-      <w:pPr/>
-      <w:r>
-        <w:t>• SIMCE Panguipulli: pendiente el exporte de Aptus.</w:t>
-      </w:r>
-    </w:p>
-    <w:p>
-      <w:pPr/>
-      <w:r>
-        <w:t>Las evaluaciones que no están en esta lista se cargan por el camino 2.2 (Valores → Importar).</w:t>
-      </w:r>
-    </w:p>
-    <w:p>
-      <w:pPr/>
-      <w:r>
-        <w:t>¿Se te quedó algo en el camino? El tutorial extendido tiene el paso a paso completo y una tabla de problemas frecuentes.</w:t>
+        <w:t>SIMCE Panguipulli: pendiente — cómo se obtiene el archivo de Aptus.</w:t>
+      </w:r>
+    </w:p>
+    <w:p>
+      <w:pPr/>
+      <w:r>
+        <w:t>• SIMCE Panguipulli: pendiente — cómo se obtiene el archivo de Aptus.</w:t>
+      </w:r>
+    </w:p>
+    <w:p>
+      <w:pPr/>
+      <w:r>
+        <w:t>Las evaluaciones que no aparecen en esta lista se cargan por el camino 2.2 (Valores → Importar).</w:t>
+      </w:r>
+    </w:p>
+    <w:p>
+      <w:pPr/>
+      <w:r>
+        <w:t>¿Se te quedó algo en el camino? El tutorial extendido tiene el paso a paso completo y una tabla con los problemas más frecuentes.</w:t>
       </w:r>
     </w:p>
     <w:sectPr>

</xml_diff>

<commit_message>
docs(tutoriales): alinear el tutorial extendido con la UI actual
Renombra "Pipelines" por "Ejecución" y "Centro de Ejecución", y ajusta los
pasos al flujo real de la pantalla (tarjetas con "Ejecutar Proceso", el botón
que alterna entre Siguiente y Continuar). Agrega los entregables generados en
Word y PDF del tutorial y de la guía rápida.

Cambios que estaban sin commitear desde el 2026-07-31.

Co-Authored-By: Claude Opus 5 <noreply@anthropic.com>
</commit_message>
<xml_diff>
--- a/docs/tutoriales/guia_rapida_usuario.docx
+++ b/docs/tutoriales/guia_rapida_usuario.docx
@@ -105,7 +105,34 @@
     <w:p>
       <w:pPr/>
       <w:r>
-        <w:t>Hay dos caminos y vas a usar solo uno. Para saber cuál te toca, entra a Ejecución en el menú de la izquierda. Esa pantalla se llama Centro de Ejecución y muestra una tarjeta por cada proceso ya configurado para tu colegio. Un proceso es una carga automática que el equipo dejó lista: tú solo entregas los archivos. Si ves una tarjeta con el nombre de tu evaluación, sigue el camino 2.1. Si no aparece ninguna, sigue el 2.2.</w:t>
+        <w:t xml:space="preserve">Hay </w:t>
+      </w:r>
+      <w:r>
+        <w:rPr>
+          <w:b/>
+        </w:rPr>
+        <w:t>dos caminos</w:t>
+      </w:r>
+      <w:r>
+        <w:t xml:space="preserve"> y vas a usar solo uno. Para saber cuál te toca, entra a </w:t>
+      </w:r>
+      <w:r>
+        <w:rPr>
+          <w:b/>
+        </w:rPr>
+        <w:t>Ejecución</w:t>
+      </w:r>
+      <w:r>
+        <w:t xml:space="preserve"> en el menú de la izquierda. Esa pantalla se llama </w:t>
+      </w:r>
+      <w:r>
+        <w:rPr>
+          <w:b/>
+        </w:rPr>
+        <w:t>Centro de Ejecución</w:t>
+      </w:r>
+      <w:r>
+        <w:t xml:space="preserve"> y muestra una tarjeta por cada proceso ya configurado para tu colegio. Un proceso es una carga automática que el equipo dejó lista: tú solo entregas los archivos. Si ves una tarjeta con el nombre de tu evaluación, sigue el camino 2.1. Si no aparece ninguna, sigue el 2.2.</w:t>
       </w:r>
     </w:p>
     <w:p>
@@ -119,7 +146,16 @@
     <w:p>
       <w:pPr/>
       <w:r>
-        <w:t>Busca la tarjeta de tu evaluación y haz clic en Ejecutar Proceso.</w:t>
+        <w:t xml:space="preserve">Busca la tarjeta de tu evaluación y haz clic en </w:t>
+      </w:r>
+      <w:r>
+        <w:rPr>
+          <w:b/>
+        </w:rPr>
+        <w:t>Ejecutar Proceso</w:t>
+      </w:r>
+      <w:r>
+        <w:t>.</w:t>
       </w:r>
     </w:p>
     <w:p>
@@ -225,128 +261,218 @@
       </w:r>
     </w:p>
     <w:p>
+      <w:pPr>
+        <w:ind w:left="360" w:hanging="360"/>
+      </w:pPr>
+      <w:r>
+        <w:t xml:space="preserve">1. </w:t>
+      </w:r>
       <w:r>
         <w:t>Arrastra el archivo hasta el recuadro, o haz clic en el recuadro y búscalo en tu computador.</w:t>
       </w:r>
     </w:p>
     <w:p>
+      <w:pPr>
+        <w:ind w:left="360" w:hanging="360"/>
+      </w:pPr>
+      <w:r>
+        <w:t xml:space="preserve">2. </w:t>
+      </w:r>
+      <w:r>
+        <w:t xml:space="preserve">Haz lo mismo con cada recuadro. Los que dicen </w:t>
+      </w:r>
+      <w:r>
+        <w:rPr>
+          <w:i/>
+        </w:rPr>
+        <w:t>opcional</w:t>
+      </w:r>
+      <w:r>
+        <w:t xml:space="preserve"> puedes dejarlos vacíos.</w:t>
+      </w:r>
+    </w:p>
+    <w:p>
+      <w:pPr>
+        <w:ind w:left="360" w:hanging="360"/>
+      </w:pPr>
+      <w:r>
+        <w:t xml:space="preserve">3. </w:t>
+      </w:r>
+      <w:r>
+        <w:t xml:space="preserve">Haz clic en </w:t>
+      </w:r>
+      <w:r>
+        <w:rPr>
+          <w:b/>
+        </w:rPr>
+        <w:t>Siguiente</w:t>
+      </w:r>
+      <w:r>
+        <w:t xml:space="preserve"> y el proceso sigue avanzando.</w:t>
+      </w:r>
+    </w:p>
+    <w:p>
+      <w:pPr>
+        <w:ind w:left="360" w:hanging="360"/>
+      </w:pPr>
+      <w:r>
+        <w:t xml:space="preserve">4. </w:t>
+      </w:r>
+      <w:r>
+        <w:t>A veces el proceso te pide además un dato escrito, por ejemplo el mes de la prueba. Complétalo y confirma.</w:t>
+      </w:r>
+    </w:p>
+    <w:p>
       <w:pPr/>
       <w:r>
-        <w:t>• Arrastra el archivo hasta el recuadro, o haz clic en el recuadro y búscalo en tu computador.</w:t>
-      </w:r>
-    </w:p>
-    <w:p>
-      <w:r>
-        <w:t>Haz lo mismo con cada recuadro. Los que dicen “opcional” puedes dejarlos vacíos.</w:t>
+        <w:t xml:space="preserve">Cuando termine vas a ver el mensaje </w:t>
+      </w:r>
+      <w:r>
+        <w:rPr>
+          <w:b/>
+        </w:rPr>
+        <w:t>¡Proceso Completado!</w:t>
+      </w:r>
+      <w:r>
+        <w:t xml:space="preserve">: tus datos ya quedaron guardados. Cierra la ventana con </w:t>
+      </w:r>
+      <w:r>
+        <w:rPr>
+          <w:b/>
+        </w:rPr>
+        <w:t>Finalizar</w:t>
+      </w:r>
+      <w:r>
+        <w:t>.</w:t>
       </w:r>
     </w:p>
     <w:p>
       <w:pPr/>
       <w:r>
-        <w:t>• Haz lo mismo con cada recuadro. Los que dicen “opcional” puedes dejarlos vacíos.</w:t>
-      </w:r>
-    </w:p>
-    <w:p>
-      <w:r>
-        <w:t>Haz clic en Siguiente y el proceso sigue avanzando.</w:t>
+        <w:t xml:space="preserve">¿Qué archivo va en cada recuadro? ¿Qué no hay que modificarle? Está todo en el </w:t>
+      </w:r>
+      <w:r>
+        <w:rPr>
+          <w:b/>
+        </w:rPr>
+        <w:t>anexo de carga por evaluación</w:t>
+      </w:r>
+      <w:r>
+        <w:t>, un documento aparte de esta guía. Si no lo tienes, pídeselo al administrador.</w:t>
+      </w:r>
+    </w:p>
+    <w:p>
+      <w:pPr>
+        <w:pStyle w:val="Ttulo2"/>
+      </w:pPr>
+      <w:r>
+        <w:t>La evaluación no tiene proceso configurado</w:t>
       </w:r>
     </w:p>
     <w:p>
       <w:pPr/>
       <w:r>
-        <w:t>• Haz clic en Siguiente y el proceso sigue avanzando.</w:t>
-      </w:r>
-    </w:p>
-    <w:p>
-      <w:r>
-        <w:t>A veces el proceso te pide además un dato escrito, por ejemplo el mes de la prueba. Complétalo y confirma.</w:t>
-      </w:r>
-    </w:p>
-    <w:p>
-      <w:pPr/>
-      <w:r>
-        <w:t>• A veces el proceso te pide además un dato escrito, por ejemplo el mes de la prueba. Complétalo y confirma.</w:t>
-      </w:r>
-    </w:p>
-    <w:p>
-      <w:pPr/>
-      <w:r>
-        <w:t>Cuando termine vas a ver el mensaje “¡Proceso Completado!”: tus datos ya quedaron guardados. Cierra la ventana con Finalizar.</w:t>
-      </w:r>
-    </w:p>
-    <w:p>
-      <w:pPr/>
-      <w:r>
-        <w:t>¿Qué archivo va en cada recuadro? ¿Qué no hay que modificarle? Está todo en el anexo de carga por evaluación.</w:t>
-      </w:r>
-    </w:p>
-    <w:p>
-      <w:pPr>
-        <w:pStyle w:val="Ttulo2"/>
-      </w:pPr>
-      <w:r>
-        <w:t>La evaluación no tiene proceso configurado</w:t>
-      </w:r>
-    </w:p>
-    <w:p>
-      <w:pPr/>
-      <w:r>
         <w:t>Los datos se suben a mano, desde una planilla Excel:</w:t>
       </w:r>
     </w:p>
     <w:p>
-      <w:r>
-        <w:t>Entra a Valores en el menú de la izquierda y elige la métrica que vas a llenar (una métrica es un conjunto de datos, por ejemplo los puntajes de SIMCE Lenguaje).</w:t>
-      </w:r>
-    </w:p>
-    <w:p>
-      <w:pPr/>
-      <w:r>
-        <w:t>• Entra a Valores en el menú de la izquierda y elige la métrica que vas a llenar (una métrica es un conjunto de datos, por ejemplo los puntajes de SIMCE Lenguaje).</w:t>
-      </w:r>
-    </w:p>
-    <w:p>
-      <w:r>
-        <w:t>Haz clic en Importar, arriba a la derecha de la tabla.</w:t>
-      </w:r>
-    </w:p>
-    <w:p>
-      <w:pPr/>
-      <w:r>
-        <w:t>• Haz clic en Importar, arriba a la derecha de la tabla.</w:t>
-      </w:r>
-    </w:p>
-    <w:p>
-      <w:r>
-        <w:t>¿Todavía no tienes la planilla? Haz clic en Descargar Plantilla. Se baja un Excel con las columnas exactas de esa métrica, listo para rellenar.</w:t>
-      </w:r>
-    </w:p>
-    <w:p>
-      <w:pPr/>
-      <w:r>
-        <w:t>• ¿Todavía no tienes la planilla? Haz clic en Descargar Plantilla. Se baja un Excel con las columnas exactas de esa métrica, listo para rellenar.</w:t>
-      </w:r>
-    </w:p>
-    <w:p>
+      <w:pPr>
+        <w:ind w:left="360" w:hanging="360"/>
+      </w:pPr>
+      <w:r>
+        <w:t xml:space="preserve">1. </w:t>
+      </w:r>
+      <w:r>
+        <w:t xml:space="preserve">Entra a </w:t>
+      </w:r>
+      <w:r>
+        <w:rPr>
+          <w:b/>
+        </w:rPr>
+        <w:t>Valores</w:t>
+      </w:r>
+      <w:r>
+        <w:t xml:space="preserve"> en el menú de la izquierda y elige la métrica que vas a llenar (una métrica es un conjunto de datos, por ejemplo los puntajes de SIMCE Lenguaje).</w:t>
+      </w:r>
+    </w:p>
+    <w:p>
+      <w:pPr>
+        <w:ind w:left="360" w:hanging="360"/>
+      </w:pPr>
+      <w:r>
+        <w:t xml:space="preserve">2. </w:t>
+      </w:r>
+      <w:r>
+        <w:t xml:space="preserve">Haz clic en </w:t>
+      </w:r>
+      <w:r>
+        <w:rPr>
+          <w:b/>
+        </w:rPr>
+        <w:t>Importar</w:t>
+      </w:r>
+      <w:r>
+        <w:t>, arriba a la derecha de la tabla.</w:t>
+      </w:r>
+    </w:p>
+    <w:p>
+      <w:pPr>
+        <w:ind w:left="360" w:hanging="360"/>
+      </w:pPr>
+      <w:r>
+        <w:t xml:space="preserve">3. </w:t>
+      </w:r>
+      <w:r>
+        <w:t xml:space="preserve">¿Todavía no tienes la planilla? Haz clic en </w:t>
+      </w:r>
+      <w:r>
+        <w:rPr>
+          <w:b/>
+        </w:rPr>
+        <w:t>Descargar Plantilla</w:t>
+      </w:r>
+      <w:r>
+        <w:t>. Se baja un Excel con las columnas exactas de esa métrica, listo para rellenar.</w:t>
+      </w:r>
+    </w:p>
+    <w:p>
+      <w:pPr>
+        <w:ind w:left="360" w:hanging="360"/>
+      </w:pPr>
+      <w:r>
+        <w:t xml:space="preserve">4. </w:t>
+      </w:r>
       <w:r>
         <w:t>Rellena la planilla.</w:t>
       </w:r>
     </w:p>
     <w:p>
-      <w:pPr/>
-      <w:r>
-        <w:t>• Rellena la planilla.</w:t>
-      </w:r>
-    </w:p>
-    <w:p>
-      <w:r>
-        <w:t>Arrástrala al recuadro, o búscala con Seleccionar Archivos, y haz clic en Importar.</w:t>
-      </w:r>
-    </w:p>
-    <w:p>
-      <w:pPr/>
-      <w:r>
-        <w:t>• Arrástrala al recuadro, o búscala con Seleccionar Archivos, y haz clic en Importar.</w:t>
+      <w:pPr>
+        <w:ind w:left="360" w:hanging="360"/>
+      </w:pPr>
+      <w:r>
+        <w:t xml:space="preserve">5. </w:t>
+      </w:r>
+      <w:r>
+        <w:t xml:space="preserve">Arrástrala al recuadro, o búscala con </w:t>
+      </w:r>
+      <w:r>
+        <w:rPr>
+          <w:b/>
+        </w:rPr>
+        <w:t>Seleccionar Archivos</w:t>
+      </w:r>
+      <w:r>
+        <w:t xml:space="preserve">, y haz clic en </w:t>
+      </w:r>
+      <w:r>
+        <w:rPr>
+          <w:b/>
+        </w:rPr>
+        <w:t>Importar</w:t>
+      </w:r>
+      <w:r>
+        <w:t>.</w:t>
       </w:r>
     </w:p>
     <w:p>
@@ -416,7 +542,34 @@
     <w:p>
       <w:pPr/>
       <w:r>
-        <w:t>Con cualquiera de los dos caminos, revisa lo que quedó guardado. Entra a Valores y elige tu métrica. Mira el total de filas, que aparece arriba de la tabla, y confirma que los cursos y los meses sean los que esperabas. El botón Filtros te deja mostrar solo una parte de la tabla, por ejemplo un curso. En “Buscar en los datos...” escribes un nombre o un RUT para encontrarlo. Si ves datos repetidos, o datos de una carga equivocada, avisa al administrador antes de seguir: es más fácil corregirlo ahora que después.</w:t>
+        <w:t xml:space="preserve">Con cualquiera de los dos caminos, revisa lo que quedó guardado. Entra a </w:t>
+      </w:r>
+      <w:r>
+        <w:rPr>
+          <w:b/>
+        </w:rPr>
+        <w:t>Valores</w:t>
+      </w:r>
+      <w:r>
+        <w:t xml:space="preserve"> y elige tu métrica. Mira el total de filas, que aparece arriba de la tabla, y confirma que los cursos y los meses sean los que esperabas. El botón </w:t>
+      </w:r>
+      <w:r>
+        <w:rPr>
+          <w:b/>
+        </w:rPr>
+        <w:t>Filtros</w:t>
+      </w:r>
+      <w:r>
+        <w:t xml:space="preserve"> te deja mostrar solo una parte de la tabla, por ejemplo un curso. En </w:t>
+      </w:r>
+      <w:r>
+        <w:rPr>
+          <w:b/>
+        </w:rPr>
+        <w:t>Buscar en los datos...</w:t>
+      </w:r>
+      <w:r>
+        <w:t xml:space="preserve"> escribes un nombre o un RUT para encontrarlo. Si ves datos repetidos, o datos de una carga equivocada, avisa al administrador antes de seguir: es más fácil corregirlo ahora que después.</w:t>
       </w:r>
     </w:p>
     <w:p>
@@ -478,7 +631,16 @@
     <w:p>
       <w:pPr/>
       <w:r>
-        <w:t>Entra a Resultados y elige tu indicador en la lista de arriba. Un indicador es aquello que la evaluación mide, por ejemplo la comprensión lectora. Los gráficos se arman solos: esa pantalla llena de gráficos es el dashboard.</w:t>
+        <w:t xml:space="preserve">Entra a </w:t>
+      </w:r>
+      <w:r>
+        <w:rPr>
+          <w:b/>
+        </w:rPr>
+        <w:t>Resultados</w:t>
+      </w:r>
+      <w:r>
+        <w:t xml:space="preserve"> y elige tu indicador en la lista de arriba. Un indicador es aquello que la evaluación mide, por ejemplo la comprensión lectora. Los gráficos se arman solos: esa pantalla llena de gráficos es el dashboard.</w:t>
       </w:r>
     </w:p>
     <w:p>
@@ -530,53 +692,104 @@
       </w:r>
     </w:p>
     <w:p>
-      <w:r>
-        <w:t>Pestañas (Vista General, Por Curso, Por Estudiante, Tendencia): cada una muestra los mismos datos, pero mirados de otra forma.</w:t>
+      <w:pPr>
+        <w:ind w:left="360" w:hanging="360"/>
+      </w:pPr>
+      <w:r>
+        <w:t xml:space="preserve">• </w:t>
+      </w:r>
+      <w:r>
+        <w:rPr>
+          <w:b/>
+        </w:rPr>
+        <w:t>Pestañas</w:t>
+      </w:r>
+      <w:r>
+        <w:t xml:space="preserve"> (Vista General, Por Curso, Por Estudiante, Tendencia): cada una muestra los mismos datos, pero mirados de otra forma.</w:t>
+      </w:r>
+    </w:p>
+    <w:p>
+      <w:pPr>
+        <w:ind w:left="360" w:hanging="360"/>
+      </w:pPr>
+      <w:r>
+        <w:t xml:space="preserve">• </w:t>
+      </w:r>
+      <w:r>
+        <w:rPr>
+          <w:b/>
+        </w:rPr>
+        <w:t>Tarjetas de resumen</w:t>
+      </w:r>
+      <w:r>
+        <w:t>: los números grandes de arriba. Traen el total de alumnos, el rendimiento general y el nivel que más se repite.</w:t>
+      </w:r>
+    </w:p>
+    <w:p>
+      <w:pPr>
+        <w:ind w:left="360" w:hanging="360"/>
+      </w:pPr>
+      <w:r>
+        <w:t xml:space="preserve">• </w:t>
+      </w:r>
+      <w:r>
+        <w:rPr>
+          <w:b/>
+        </w:rPr>
+        <w:t>Tablas y gráficos</w:t>
+      </w:r>
+      <w:r>
+        <w:t>: el detalle curso por curso.</w:t>
+      </w:r>
+    </w:p>
+    <w:p>
+      <w:pPr>
+        <w:ind w:left="360" w:hanging="360"/>
+      </w:pPr>
+      <w:r>
+        <w:t xml:space="preserve">• </w:t>
+      </w:r>
+      <w:r>
+        <w:rPr>
+          <w:b/>
+        </w:rPr>
+        <w:t>Colores de los niveles de logro</w:t>
+      </w:r>
+      <w:r>
+        <w:t>: son siempre los mismos en todo el sistema, rojo el nivel más bajo y verde el más alto. Así lees un gráfico sin revisar la leyenda.</w:t>
       </w:r>
     </w:p>
     <w:p>
       <w:pPr/>
       <w:r>
-        <w:t>• Pestañas (Vista General, Por Curso, Por Estudiante, Tendencia): cada una muestra los mismos datos, pero mirados de otra forma.</w:t>
-      </w:r>
-    </w:p>
-    <w:p>
-      <w:r>
-        <w:t>Tarjetas de resumen: los números grandes de arriba. Traen el total de alumnos, el rendimiento general y el nivel que más se repite.</w:t>
-      </w:r>
-    </w:p>
-    <w:p>
-      <w:pPr/>
-      <w:r>
-        <w:t>• Tarjetas de resumen: los números grandes de arriba. Traen el total de alumnos, el rendimiento general y el nivel que más se repite.</w:t>
-      </w:r>
-    </w:p>
-    <w:p>
-      <w:r>
-        <w:t>Tablas y gráficos: el detalle curso por curso.</w:t>
-      </w:r>
-    </w:p>
-    <w:p>
-      <w:pPr/>
-      <w:r>
-        <w:t>• Tablas y gráficos: el detalle curso por curso.</w:t>
-      </w:r>
-    </w:p>
-    <w:p>
-      <w:r>
-        <w:t>Colores de los niveles de logro: son siempre los mismos en todo el sistema, rojo el nivel más bajo y verde el más alto. Así lees un gráfico sin revisar la leyenda.</w:t>
-      </w:r>
-    </w:p>
-    <w:p>
-      <w:pPr/>
-      <w:r>
-        <w:t>• Colores de los niveles de logro: son siempre los mismos en todo el sistema, rojo el nivel más bajo y verde el más alto. Así lees un gráfico sin revisar la leyenda.</w:t>
-      </w:r>
-    </w:p>
-    <w:p>
-      <w:pPr/>
-      <w:r>
-        <w:t>Para mirar solo una parte de los datos, usa los filtros que están debajo del indicador. Al elegir un valor aparece una etiqueta con el filtro que quedó puesto, y todos los gráficos se actualizan al mismo tiempo. Para sacar un filtro, haz clic en la × de su etiqueta. Para sacarlos todos de una vez, usa Limpiar.</w:t>
+        <w:t xml:space="preserve">Para mirar solo una parte de los datos, usa los </w:t>
+      </w:r>
+      <w:r>
+        <w:rPr>
+          <w:b/>
+        </w:rPr>
+        <w:t>filtros</w:t>
+      </w:r>
+      <w:r>
+        <w:t xml:space="preserve"> que están debajo del indicador. Al elegir un valor aparece una etiqueta con el filtro que quedó puesto, y todos los gráficos se actualizan al mismo tiempo. Para sacar un filtro, haz clic en la </w:t>
+      </w:r>
+      <w:r>
+        <w:rPr>
+          <w:b/>
+        </w:rPr>
+        <w:t>×</w:t>
+      </w:r>
+      <w:r>
+        <w:t xml:space="preserve"> de su etiqueta. Para sacarlos todos de una vez, usa </w:t>
+      </w:r>
+      <w:r>
+        <w:rPr>
+          <w:b/>
+        </w:rPr>
+        <w:t>Limpiar</w:t>
+      </w:r>
+      <w:r>
+        <w:t>.</w:t>
       </w:r>
     </w:p>
     <w:p>
@@ -646,7 +859,16 @@
     <w:p>
       <w:pPr/>
       <w:r>
-        <w:t>Con tu indicador en pantalla, haz clic en Generar informe. Se abre una ventana con una tarjeta por cada tipo de informe. Haz clic en la que necesites y el PDF se descarga.</w:t>
+        <w:t xml:space="preserve">Con tu indicador en pantalla, haz clic en </w:t>
+      </w:r>
+      <w:r>
+        <w:rPr>
+          <w:b/>
+        </w:rPr>
+        <w:t>Generar informe</w:t>
+      </w:r>
+      <w:r>
+        <w:t>. Se abre una ventana con una tarjeta por cada tipo de informe. Haz clic en la que necesites y el PDF se descarga.</w:t>
       </w:r>
     </w:p>
     <w:p>
@@ -821,61 +1043,40 @@
     <w:p>
       <w:pPr/>
       <w:r>
-        <w:t>Más abajo, en Informes especializados, están los informes con el formato oficial de cada evaluación. A la derecha de cada tarjeta hay un botón con forma de controles deslizantes. Ese botón abre un panel para cambiar, antes de descargar, el texto de arriba del PDF, el de abajo y el nombre del archivo.</w:t>
+        <w:t xml:space="preserve">Más abajo, en </w:t>
+      </w:r>
+      <w:r>
+        <w:rPr>
+          <w:b/>
+        </w:rPr>
+        <w:t>Informes especializados</w:t>
+      </w:r>
+      <w:r>
+        <w:t>, están los informes con el formato oficial de cada evaluación. A la derecha de cada tarjeta hay un botón con forma de controles deslizantes. Ese botón abre un panel para cambiar, antes de descargar, el texto de arriba del PDF, el de abajo y el nombre del archivo.</w:t>
       </w:r>
     </w:p>
     <w:p>
       <w:pPr/>
       <w:r>
-        <w:t>Las tarjetas grises no se pueden descargar y la razón está escrita en la misma tarjeta. Si dice “Sin datos cargados para este indicador”, vuelve a la sección 2. Si dice “Este informe aún no está configurado”, avísale al administrador. Así se ve el PDF que descargas:</w:t>
-      </w:r>
-    </w:p>
-    <w:p>
-      <w:pPr>
-        <w:jc w:val="center"/>
-      </w:pPr>
-      <w:r>
-        <w:drawing>
-          <wp:inline xmlns:a="http://schemas.openxmlformats.org/drawingml/2006/main" xmlns:pic="http://schemas.openxmlformats.org/drawingml/2006/picture">
-            <wp:extent cx="5303520" cy="6863379"/>
-            <wp:docPr id="9" name="Picture 9"/>
-            <wp:cNvGraphicFramePr>
-              <a:graphicFrameLocks noChangeAspect="1"/>
-            </wp:cNvGraphicFramePr>
-            <a:graphic>
-              <a:graphicData uri="http://schemas.openxmlformats.org/drawingml/2006/picture">
-                <pic:pic>
-                  <pic:nvPicPr>
-                    <pic:cNvPr id="0" name="informe_pdf.png"/>
-                    <pic:cNvPicPr/>
-                  </pic:nvPicPr>
-                  <pic:blipFill>
-                    <a:blip r:embed="rId20"/>
-                    <a:stretch>
-                      <a:fillRect/>
-                    </a:stretch>
-                  </pic:blipFill>
-                  <pic:spPr>
-                    <a:xfrm>
-                      <a:off x="0" y="0"/>
-                      <a:ext cx="5303520" cy="6863379"/>
-                    </a:xfrm>
-                    <a:prstGeom prst="rect"/>
-                  </pic:spPr>
-                </pic:pic>
-              </a:graphicData>
-            </a:graphic>
-          </wp:inline>
-        </w:drawing>
-      </w:r>
-    </w:p>
-    <w:p>
-      <w:pPr>
-        <w:pStyle w:val="Descripcin"/>
-        <w:jc w:val="center"/>
-      </w:pPr>
-      <w:r>
-        <w:t>Primera página del informe descargado.</w:t>
+        <w:t xml:space="preserve">Las tarjetas grises no se pueden descargar y la razón está escrita en la misma tarjeta. Si dice </w:t>
+      </w:r>
+      <w:r>
+        <w:rPr>
+          <w:i/>
+        </w:rPr>
+        <w:t>Sin datos cargados para este indicador</w:t>
+      </w:r>
+      <w:r>
+        <w:t xml:space="preserve">, vuelve a la sección 2. Si dice </w:t>
+      </w:r>
+      <w:r>
+        <w:rPr>
+          <w:i/>
+        </w:rPr>
+        <w:t>Este informe aún no está configurado</w:t>
+      </w:r>
+      <w:r>
+        <w:t>, avísale al administrador.</w:t>
       </w:r>
     </w:p>
     <w:p>
@@ -897,52 +1098,106 @@
     <w:p>
       <w:pPr/>
       <w:r>
-        <w:t>Lo que tienes que tener a mano antes de empezar la carga. El detalle de cada archivo está en el anexo de carga por evaluación: cómo se llama el recuadro en pantalla, en qué formato va y qué no hay que modificarle.</w:t>
-      </w:r>
-    </w:p>
-    <w:p>
-      <w:r>
-        <w:t>SIMCE Pullinque: Resultados por alumno · Resultados por pregunta · Habilidad y Eje Temático.</w:t>
+        <w:t xml:space="preserve">Lo que tienes que tener a mano antes de empezar la carga. El detalle de cada archivo —cómo se llama el recuadro en pantalla, en qué formato va y qué no hay que modificarle— está en el </w:t>
+      </w:r>
+      <w:r>
+        <w:rPr>
+          <w:b/>
+        </w:rPr>
+        <w:t>anexo de carga por evaluación</w:t>
+      </w:r>
+      <w:r>
+        <w:t xml:space="preserve"> (el documento aparte que menciona la sección 2.1).</w:t>
+      </w:r>
+    </w:p>
+    <w:p>
+      <w:pPr>
+        <w:ind w:left="360" w:hanging="360"/>
+      </w:pPr>
+      <w:r>
+        <w:t xml:space="preserve">• </w:t>
+      </w:r>
+      <w:r>
+        <w:rPr>
+          <w:b/>
+        </w:rPr>
+        <w:t>SIMCE Pullinque</w:t>
+      </w:r>
+      <w:r>
+        <w:t>: Resultados por alumno · Resultados por pregunta · Habilidad y Eje Temático.</w:t>
+      </w:r>
+    </w:p>
+    <w:p>
+      <w:pPr>
+        <w:ind w:left="360" w:hanging="360"/>
+      </w:pPr>
+      <w:r>
+        <w:t xml:space="preserve">• </w:t>
+      </w:r>
+      <w:r>
+        <w:rPr>
+          <w:b/>
+        </w:rPr>
+        <w:t>DIA</w:t>
+      </w:r>
+      <w:r>
+        <w:t>: PDF de resultados · Excel con resultados por alumno.</w:t>
+      </w:r>
+    </w:p>
+    <w:p>
+      <w:pPr>
+        <w:ind w:left="360" w:hanging="360"/>
+      </w:pPr>
+      <w:r>
+        <w:t xml:space="preserve">• </w:t>
+      </w:r>
+      <w:r>
+        <w:rPr>
+          <w:b/>
+        </w:rPr>
+        <w:t>SIMCE Panguipulli</w:t>
+      </w:r>
+      <w:r>
+        <w:t xml:space="preserve">: </w:t>
+      </w:r>
+      <w:r>
+        <w:rPr>
+          <w:i/>
+        </w:rPr>
+        <w:t>pendiente — cómo se obtiene el archivo de Aptus</w:t>
+      </w:r>
+      <w:r>
+        <w:t>.</w:t>
       </w:r>
     </w:p>
     <w:p>
       <w:pPr/>
       <w:r>
-        <w:t>• SIMCE Pullinque: Resultados por alumno · Resultados por pregunta · Habilidad y Eje Temático.</w:t>
-      </w:r>
-    </w:p>
-    <w:p>
-      <w:r>
-        <w:t>DIA: PDF de resultados · Excel con resultados por alumno.</w:t>
+        <w:t>Las evaluaciones que no aparecen en esta lista se cargan por el camino 2.2 (</w:t>
+      </w:r>
+      <w:r>
+        <w:rPr>
+          <w:b/>
+        </w:rPr>
+        <w:t>Valores → Importar</w:t>
+      </w:r>
+      <w:r>
+        <w:t>).</w:t>
       </w:r>
     </w:p>
     <w:p>
       <w:pPr/>
       <w:r>
-        <w:t>• DIA: PDF de resultados · Excel con resultados por alumno.</w:t>
-      </w:r>
-    </w:p>
-    <w:p>
-      <w:r>
-        <w:t>SIMCE Panguipulli: pendiente — cómo se obtiene el archivo de Aptus.</w:t>
-      </w:r>
-    </w:p>
-    <w:p>
-      <w:pPr/>
-      <w:r>
-        <w:t>• SIMCE Panguipulli: pendiente — cómo se obtiene el archivo de Aptus.</w:t>
-      </w:r>
-    </w:p>
-    <w:p>
-      <w:pPr/>
-      <w:r>
-        <w:t>Las evaluaciones que no aparecen en esta lista se cargan por el camino 2.2 (Valores → Importar).</w:t>
-      </w:r>
-    </w:p>
-    <w:p>
-      <w:pPr/>
-      <w:r>
-        <w:t>¿Se te quedó algo en el camino? El tutorial extendido tiene el paso a paso completo y una tabla con los problemas más frecuentes.</w:t>
+        <w:t xml:space="preserve">¿Se te quedó algo en el camino? El </w:t>
+      </w:r>
+      <w:r>
+        <w:rPr>
+          <w:b/>
+        </w:rPr>
+        <w:t>tutorial extendido</w:t>
+      </w:r>
+      <w:r>
+        <w:t xml:space="preserve"> tiene el paso a paso completo y una sección de problemas frecuentes. Pídeselo al administrador.</w:t>
       </w:r>
     </w:p>
     <w:sectPr>

</xml_diff>